<commit_message>
Fix TCC PDF margins and pagination
</commit_message>
<xml_diff>
--- a/docs/tcc/TCC II - Eduardo Marques - Versao Final Revisada.docx
+++ b/docs/tcc/TCC II - Eduardo Marques - Versao Final Revisada.docx
@@ -337,6 +337,9 @@
         </w:rPr>
       </w:pPr>
       <w:r>
+        <w:rPr>
+          <w:b/>
+        </w:rPr>
         <w:t>DESENVOLVIMENTO DE PLATAFORMA WEB PARA APOIO À ANÁLISE DE EEG COM INTELIGÊNCIA ARTIFICIAL EXPLICÁVEL</w:t>
       </w:r>
     </w:p>
@@ -684,6 +687,9 @@
         </w:rPr>
       </w:pPr>
       <w:r>
+        <w:rPr>
+          <w:b/>
+        </w:rPr>
         <w:t>DESENVOLVIMENTO DE PLATAFORMA WEB PARA APOIO À ANÁLISE DE EEG COM INTELIGÊNCIA ARTIFICIAL EXPLICÁVEL</w:t>
       </w:r>
     </w:p>
@@ -991,7 +997,7 @@
     <w:p>
       <w:pPr>
         <w:spacing w:after="0" w:line="360" w:lineRule="auto"/>
-        <w:ind w:left="-425.19685039370086" w:firstLine="0"/>
+        <w:ind w:left="0" w:firstLine="0"/>
         <w:jc w:val="both"/>
         <w:rPr>
           <w:sz w:val="24"/>
@@ -1010,7 +1016,7 @@
     <w:p>
       <w:pPr>
         <w:spacing w:after="0" w:line="360" w:lineRule="auto"/>
-        <w:ind w:left="-425.19685039370086" w:firstLine="0"/>
+        <w:ind w:left="0" w:firstLine="0"/>
         <w:jc w:val="both"/>
         <w:rPr/>
       </w:pPr>
@@ -1132,7 +1138,7 @@
                 <w:b w:val="0"/>
                 <w:sz w:val="20"/>
               </w:rPr>
-              <w:t>4</w:t>
+              <w:t>5</w:t>
             </w:r>
           </w:p>
         </w:tc>
@@ -1174,7 +1180,7 @@
                 <w:b w:val="0"/>
                 <w:sz w:val="20"/>
               </w:rPr>
-              <w:t>4</w:t>
+              <w:t>5</w:t>
             </w:r>
           </w:p>
         </w:tc>
@@ -1510,7 +1516,7 @@
                 <w:b w:val="0"/>
                 <w:sz w:val="20"/>
               </w:rPr>
-              <w:t>9</w:t>
+              <w:t>10</w:t>
             </w:r>
           </w:p>
         </w:tc>
@@ -1552,7 +1558,7 @@
                 <w:b/>
                 <w:sz w:val="20"/>
               </w:rPr>
-              <w:t>10</w:t>
+              <w:t>11</w:t>
             </w:r>
           </w:p>
         </w:tc>
@@ -1594,7 +1600,7 @@
                 <w:b w:val="0"/>
                 <w:sz w:val="20"/>
               </w:rPr>
-              <w:t>10</w:t>
+              <w:t>11</w:t>
             </w:r>
           </w:p>
         </w:tc>
@@ -1636,7 +1642,7 @@
                 <w:b w:val="0"/>
                 <w:sz w:val="20"/>
               </w:rPr>
-              <w:t>10</w:t>
+              <w:t>11</w:t>
             </w:r>
           </w:p>
         </w:tc>
@@ -1678,7 +1684,7 @@
                 <w:b w:val="0"/>
                 <w:sz w:val="20"/>
               </w:rPr>
-              <w:t>11</w:t>
+              <w:t>12</w:t>
             </w:r>
           </w:p>
         </w:tc>
@@ -1720,7 +1726,7 @@
                 <w:b w:val="0"/>
                 <w:sz w:val="20"/>
               </w:rPr>
-              <w:t>11</w:t>
+              <w:t>12</w:t>
             </w:r>
           </w:p>
         </w:tc>
@@ -1762,7 +1768,7 @@
                 <w:b w:val="0"/>
                 <w:sz w:val="20"/>
               </w:rPr>
-              <w:t>11</w:t>
+              <w:t>13</w:t>
             </w:r>
           </w:p>
         </w:tc>
@@ -1804,7 +1810,7 @@
                 <w:b w:val="0"/>
                 <w:sz w:val="20"/>
               </w:rPr>
-              <w:t>12</w:t>
+              <w:t>13</w:t>
             </w:r>
           </w:p>
         </w:tc>
@@ -1846,7 +1852,7 @@
                 <w:b/>
                 <w:sz w:val="20"/>
               </w:rPr>
-              <w:t>13</w:t>
+              <w:t>15</w:t>
             </w:r>
           </w:p>
         </w:tc>
@@ -1888,7 +1894,7 @@
                 <w:b w:val="0"/>
                 <w:sz w:val="20"/>
               </w:rPr>
-              <w:t>13</w:t>
+              <w:t>15</w:t>
             </w:r>
           </w:p>
         </w:tc>
@@ -1930,7 +1936,7 @@
                 <w:b w:val="0"/>
                 <w:sz w:val="20"/>
               </w:rPr>
-              <w:t>13</w:t>
+              <w:t>15</w:t>
             </w:r>
           </w:p>
         </w:tc>
@@ -1972,7 +1978,7 @@
                 <w:b w:val="0"/>
                 <w:sz w:val="20"/>
               </w:rPr>
-              <w:t>13</w:t>
+              <w:t>15</w:t>
             </w:r>
           </w:p>
         </w:tc>
@@ -2014,7 +2020,7 @@
                 <w:b w:val="0"/>
                 <w:sz w:val="20"/>
               </w:rPr>
-              <w:t>14</w:t>
+              <w:t>17</w:t>
             </w:r>
           </w:p>
         </w:tc>
@@ -2056,7 +2062,7 @@
                 <w:b w:val="0"/>
                 <w:sz w:val="20"/>
               </w:rPr>
-              <w:t>19</w:t>
+              <w:t>23</w:t>
             </w:r>
           </w:p>
         </w:tc>
@@ -2098,7 +2104,7 @@
                 <w:b w:val="0"/>
                 <w:sz w:val="20"/>
               </w:rPr>
-              <w:t>20</w:t>
+              <w:t>24</w:t>
             </w:r>
           </w:p>
         </w:tc>
@@ -2140,7 +2146,7 @@
                 <w:b w:val="0"/>
                 <w:sz w:val="20"/>
               </w:rPr>
-              <w:t>22</w:t>
+              <w:t>26</w:t>
             </w:r>
           </w:p>
         </w:tc>
@@ -2182,7 +2188,7 @@
                 <w:b w:val="0"/>
                 <w:sz w:val="20"/>
               </w:rPr>
-              <w:t>23</w:t>
+              <w:t>28</w:t>
             </w:r>
           </w:p>
         </w:tc>
@@ -2224,7 +2230,7 @@
                 <w:b w:val="0"/>
                 <w:sz w:val="20"/>
               </w:rPr>
-              <w:t>30</w:t>
+              <w:t>35</w:t>
             </w:r>
           </w:p>
         </w:tc>
@@ -2266,7 +2272,7 @@
                 <w:b/>
                 <w:sz w:val="20"/>
               </w:rPr>
-              <w:t>32</w:t>
+              <w:t>37</w:t>
             </w:r>
           </w:p>
         </w:tc>
@@ -2308,7 +2314,7 @@
                 <w:b w:val="0"/>
                 <w:sz w:val="20"/>
               </w:rPr>
-              <w:t>32</w:t>
+              <w:t>37</w:t>
             </w:r>
           </w:p>
         </w:tc>
@@ -2350,7 +2356,7 @@
                 <w:b w:val="0"/>
                 <w:sz w:val="20"/>
               </w:rPr>
-              <w:t>32</w:t>
+              <w:t>37</w:t>
             </w:r>
           </w:p>
         </w:tc>
@@ -2392,7 +2398,7 @@
                 <w:b w:val="0"/>
                 <w:sz w:val="20"/>
               </w:rPr>
-              <w:t>33</w:t>
+              <w:t>39</w:t>
             </w:r>
           </w:p>
         </w:tc>
@@ -2434,7 +2440,7 @@
                 <w:b w:val="0"/>
                 <w:sz w:val="20"/>
               </w:rPr>
-              <w:t>34</w:t>
+              <w:t>39</w:t>
             </w:r>
           </w:p>
         </w:tc>
@@ -2476,7 +2482,7 @@
                 <w:b w:val="0"/>
                 <w:sz w:val="20"/>
               </w:rPr>
-              <w:t>34</w:t>
+              <w:t>40</w:t>
             </w:r>
           </w:p>
         </w:tc>
@@ -2518,7 +2524,7 @@
                 <w:b/>
                 <w:sz w:val="20"/>
               </w:rPr>
-              <w:t>36</w:t>
+              <w:t>41</w:t>
             </w:r>
           </w:p>
         </w:tc>
@@ -2560,7 +2566,7 @@
                 <w:b w:val="0"/>
                 <w:sz w:val="20"/>
               </w:rPr>
-              <w:t>36</w:t>
+              <w:t>41</w:t>
             </w:r>
           </w:p>
         </w:tc>
@@ -2602,7 +2608,7 @@
                 <w:b/>
                 <w:sz w:val="20"/>
               </w:rPr>
-              <w:t>37</w:t>
+              <w:t>42</w:t>
             </w:r>
           </w:p>
         </w:tc>
@@ -2644,7 +2650,7 @@
                 <w:b/>
                 <w:sz w:val="20"/>
               </w:rPr>
-              <w:t>38</w:t>
+              <w:t>43</w:t>
             </w:r>
           </w:p>
         </w:tc>
@@ -2686,7 +2692,7 @@
                 <w:b/>
                 <w:sz w:val="20"/>
               </w:rPr>
-              <w:t>42</w:t>
+              <w:t>47</w:t>
             </w:r>
           </w:p>
         </w:tc>
@@ -2728,7 +2734,7 @@
                 <w:b w:val="0"/>
                 <w:sz w:val="20"/>
               </w:rPr>
-              <w:t>42</w:t>
+              <w:t>47</w:t>
             </w:r>
           </w:p>
         </w:tc>
@@ -2770,7 +2776,7 @@
                 <w:b w:val="0"/>
                 <w:sz w:val="20"/>
               </w:rPr>
-              <w:t>42</w:t>
+              <w:t>47</w:t>
             </w:r>
           </w:p>
         </w:tc>
@@ -3933,11 +3939,7 @@
         </w:rPr>
       </w:pPr>
       <w:r>
-        <w:rPr>
-          <w:color w:val="1b1c1d"/>
-          <w:rtl w:val="0"/>
-        </w:rPr>
-        <w:t>O desenvolvimento foi organizado nas etapas apresentadas na Figura 2, desde o levantamento de requisitos até a integração e a verificação técnica do protótipo.</w:t>
+        <w:t>O desenvolvimento foi organizado nas etapas apresentadas na Figura 1, desde o levantamento de requisitos até a integração e a verificação técnica do protótipo.</w:t>
       </w:r>
     </w:p>
     <w:p/>
@@ -17102,6 +17104,10 @@
         <w:rPr/>
       </w:pPr>
       <w:r>
+        <w:rPr>
+          <w:rFonts w:ascii="Arial" w:hAnsi="Arial"/>
+          <w:sz w:val="24"/>
+        </w:rPr>
         <w:t>ABOALAYON, K. A. I. et al. Seizure detection using EEG signals: a review of different EEG recording modalities, signal analysis techniques, and seizure detection systems. Informatics in Medicine Unlocked, v. 6, p. 1-18, 2016. Disponível em: https://catalog.nlm.nih.gov/discovery/fulldisplay?docid=alma9916189513406676&amp;context=L&amp;vid=01NLM_INST:01NLM_INST&amp;lang=en. Acesso em: 05 nov. 2025.</w:t>
       </w:r>
     </w:p>
@@ -17114,34 +17120,44 @@
       </w:pPr>
       <w:r>
         <w:rPr>
+          <w:rFonts w:ascii="Arial" w:hAnsi="Arial"/>
+          <w:sz w:val="24"/>
           <w:rtl w:val="0"/>
         </w:rPr>
         <w:t xml:space="preserve">ACETO, G.; PERSICO, V.; PESCO, A. </w:t>
       </w:r>
       <w:r>
         <w:rPr>
+          <w:rFonts w:ascii="Arial" w:hAnsi="Arial"/>
           <w:b w:val="1"/>
           <w:bCs w:val="1"/>
+          <w:sz w:val="24"/>
           <w:rtl w:val="0"/>
         </w:rPr>
         <w:t xml:space="preserve">Industry 4.0 and Health: Internet of Things, Big Data, and Cloud Computing for Healthcare 4.0</w:t>
       </w:r>
       <w:r>
         <w:rPr>
+          <w:rFonts w:ascii="Arial" w:hAnsi="Arial"/>
+          <w:sz w:val="24"/>
           <w:rtl w:val="0"/>
         </w:rPr>
         <w:t xml:space="preserve">. </w:t>
       </w:r>
       <w:r>
         <w:rPr>
+          <w:rFonts w:ascii="Arial" w:hAnsi="Arial"/>
           <w:i w:val="1"/>
           <w:iCs w:val="1"/>
+          <w:sz w:val="24"/>
           <w:rtl w:val="0"/>
         </w:rPr>
         <w:t xml:space="preserve">Journal of Industrial Information Integration</w:t>
       </w:r>
       <w:r>
         <w:rPr>
+          <w:rFonts w:ascii="Arial" w:hAnsi="Arial"/>
+          <w:sz w:val="24"/>
           <w:rtl w:val="0"/>
         </w:rPr>
         <w:t xml:space="preserve">, v. 18, p. 100129, 2020. Disponível em:</w:t>
@@ -17166,6 +17182,8 @@
       </w:hyperlink>
       <w:r>
         <w:rPr>
+          <w:rFonts w:ascii="Arial" w:hAnsi="Arial"/>
+          <w:sz w:val="24"/>
           <w:rtl w:val="0"/>
         </w:rPr>
         <w:t xml:space="preserve"> . Acesso em: 05 nov. 2025.</w:t>
@@ -17180,34 +17198,44 @@
       </w:pPr>
       <w:r>
         <w:rPr>
+          <w:rFonts w:ascii="Arial" w:hAnsi="Arial"/>
+          <w:sz w:val="24"/>
           <w:rtl w:val="0"/>
         </w:rPr>
         <w:t xml:space="preserve">ACHARYA, U. R. et al. </w:t>
       </w:r>
       <w:r>
         <w:rPr>
+          <w:rFonts w:ascii="Arial" w:hAnsi="Arial"/>
           <w:b w:val="1"/>
           <w:bCs w:val="1"/>
+          <w:sz w:val="24"/>
           <w:rtl w:val="0"/>
         </w:rPr>
         <w:t xml:space="preserve">Deep convolutional neural network for the automated detection and diagnosis of seizure using EEG signals</w:t>
       </w:r>
       <w:r>
         <w:rPr>
+          <w:rFonts w:ascii="Arial" w:hAnsi="Arial"/>
+          <w:sz w:val="24"/>
           <w:rtl w:val="0"/>
         </w:rPr>
         <w:t xml:space="preserve">. </w:t>
       </w:r>
       <w:r>
         <w:rPr>
+          <w:rFonts w:ascii="Arial" w:hAnsi="Arial"/>
           <w:i w:val="1"/>
           <w:iCs w:val="1"/>
+          <w:sz w:val="24"/>
           <w:rtl w:val="0"/>
         </w:rPr>
         <w:t xml:space="preserve">Computers in Biology and Medicine</w:t>
       </w:r>
       <w:r>
         <w:rPr>
+          <w:rFonts w:ascii="Arial" w:hAnsi="Arial"/>
+          <w:sz w:val="24"/>
           <w:rtl w:val="0"/>
         </w:rPr>
         <w:t xml:space="preserve">, v. 100, p. 270-278, 2018. Disponível em:</w:t>
@@ -17232,6 +17260,8 @@
       </w:hyperlink>
       <w:r>
         <w:rPr>
+          <w:rFonts w:ascii="Arial" w:hAnsi="Arial"/>
+          <w:sz w:val="24"/>
           <w:rtl w:val="0"/>
         </w:rPr>
         <w:t xml:space="preserve"> . Acesso em: 06 nov. 2025.</w:t>
@@ -17245,6 +17275,10 @@
         <w:rPr/>
       </w:pPr>
       <w:r>
+        <w:rPr>
+          <w:rFonts w:ascii="Arial" w:hAnsi="Arial"/>
+          <w:sz w:val="24"/>
+        </w:rPr>
         <w:t>ADADI, A.; BERRADA, M. Peeking inside the black-box: a survey on explainable artificial intelligence (XAI). IEEE Access, v. 6, p. 52138-52160, 2018. Disponível em: https://www.researchgate.net/publication/327709435_Peeking_Inside_the_Black-Box_A_Survey_on_Explainable_Artificial_Intelligence_XAI. Acesso em: 06 nov. 2025.</w:t>
       </w:r>
     </w:p>
@@ -17256,6 +17290,10 @@
         <w:rPr/>
       </w:pPr>
       <w:r>
+        <w:rPr>
+          <w:rFonts w:ascii="Arial" w:hAnsi="Arial"/>
+          <w:sz w:val="24"/>
+        </w:rPr>
         <w:t>AGARWAL, R. et al. The digital transformation of healthcare: current status and the road ahead. Information Systems Research, v. 21, n. 4, p. 796-809, 2010. Disponível em: https://www.researchgate.net/publication/220079558_The_Digital_Transformation_of_Healthcare_Current_Status_and_the_Road_Ahead . Acesso em: 07 nov. 2025.</w:t>
       </w:r>
     </w:p>
@@ -17268,34 +17306,44 @@
       </w:pPr>
       <w:r>
         <w:rPr>
+          <w:rFonts w:ascii="Arial" w:hAnsi="Arial"/>
+          <w:sz w:val="24"/>
           <w:rtl w:val="0"/>
         </w:rPr>
         <w:t xml:space="preserve">AMANN, J. et al. </w:t>
       </w:r>
       <w:r>
         <w:rPr>
+          <w:rFonts w:ascii="Arial" w:hAnsi="Arial"/>
           <w:b w:val="1"/>
           <w:bCs w:val="1"/>
+          <w:sz w:val="24"/>
           <w:rtl w:val="0"/>
         </w:rPr>
         <w:t xml:space="preserve">Explainability for artificial intelligence in healthcare: a multidisciplinary perspective</w:t>
       </w:r>
       <w:r>
         <w:rPr>
+          <w:rFonts w:ascii="Arial" w:hAnsi="Arial"/>
+          <w:sz w:val="24"/>
           <w:rtl w:val="0"/>
         </w:rPr>
         <w:t xml:space="preserve">. </w:t>
       </w:r>
       <w:r>
         <w:rPr>
+          <w:rFonts w:ascii="Arial" w:hAnsi="Arial"/>
           <w:i w:val="1"/>
           <w:iCs w:val="1"/>
+          <w:sz w:val="24"/>
           <w:rtl w:val="0"/>
         </w:rPr>
         <w:t xml:space="preserve">BMC Medical Informatics and Decision Making</w:t>
       </w:r>
       <w:r>
         <w:rPr>
+          <w:rFonts w:ascii="Arial" w:hAnsi="Arial"/>
+          <w:sz w:val="24"/>
           <w:rtl w:val="0"/>
         </w:rPr>
         <w:t xml:space="preserve">, v. 20, n. 1, p. 310, 2020. Disponível em:</w:t>
@@ -17320,6 +17368,8 @@
       </w:hyperlink>
       <w:r>
         <w:rPr>
+          <w:rFonts w:ascii="Arial" w:hAnsi="Arial"/>
+          <w:sz w:val="24"/>
           <w:rtl w:val="0"/>
         </w:rPr>
         <w:t xml:space="preserve"> . Acesso em: 07 nov. 2025.</w:t>
@@ -17334,34 +17384,44 @@
       </w:pPr>
       <w:r>
         <w:rPr>
+          <w:rFonts w:ascii="Arial" w:hAnsi="Arial"/>
+          <w:sz w:val="24"/>
           <w:rtl w:val="0"/>
         </w:rPr>
         <w:t xml:space="preserve">ARRIETA, A. B. et al. </w:t>
       </w:r>
       <w:r>
         <w:rPr>
+          <w:rFonts w:ascii="Arial" w:hAnsi="Arial"/>
           <w:b w:val="1"/>
           <w:bCs w:val="1"/>
+          <w:sz w:val="24"/>
           <w:rtl w:val="0"/>
         </w:rPr>
         <w:t xml:space="preserve">Explainable Artificial Intelligence (XAI): Concepts, taxonomies, opportunities and challenges toward responsible AI</w:t>
       </w:r>
       <w:r>
         <w:rPr>
+          <w:rFonts w:ascii="Arial" w:hAnsi="Arial"/>
+          <w:sz w:val="24"/>
           <w:rtl w:val="0"/>
         </w:rPr>
         <w:t xml:space="preserve">. </w:t>
       </w:r>
       <w:r>
         <w:rPr>
+          <w:rFonts w:ascii="Arial" w:hAnsi="Arial"/>
           <w:i w:val="1"/>
           <w:iCs w:val="1"/>
+          <w:sz w:val="24"/>
           <w:rtl w:val="0"/>
         </w:rPr>
         <w:t xml:space="preserve">Information Fusion</w:t>
       </w:r>
       <w:r>
         <w:rPr>
+          <w:rFonts w:ascii="Arial" w:hAnsi="Arial"/>
+          <w:sz w:val="24"/>
           <w:rtl w:val="0"/>
         </w:rPr>
         <w:t xml:space="preserve">, v. 58, p. 82-115, 2020. Disponível em:</w:t>
@@ -17388,6 +17448,8 @@
       </w:hyperlink>
       <w:r>
         <w:rPr>
+          <w:rFonts w:ascii="Arial" w:hAnsi="Arial"/>
+          <w:sz w:val="24"/>
           <w:rtl w:val="0"/>
         </w:rPr>
         <w:t xml:space="preserve">. Acesso em: 08 nov. 2025.</w:t>
@@ -17402,20 +17464,26 @@
       </w:pPr>
       <w:r>
         <w:rPr>
+          <w:rFonts w:ascii="Arial" w:hAnsi="Arial"/>
+          <w:sz w:val="24"/>
           <w:rtl w:val="0"/>
         </w:rPr>
         <w:t xml:space="preserve">BANKS, A.; PORCELLO, E. </w:t>
       </w:r>
       <w:r>
         <w:rPr>
+          <w:rFonts w:ascii="Arial" w:hAnsi="Arial"/>
           <w:b w:val="1"/>
           <w:bCs w:val="1"/>
+          <w:sz w:val="24"/>
           <w:rtl w:val="0"/>
         </w:rPr>
         <w:t xml:space="preserve">Learning React: Modern Patterns for Developing React Apps</w:t>
       </w:r>
       <w:r>
         <w:rPr>
+          <w:rFonts w:ascii="Arial" w:hAnsi="Arial"/>
+          <w:sz w:val="24"/>
           <w:rtl w:val="0"/>
         </w:rPr>
         <w:t xml:space="preserve">. 2. ed. Sebastopol: O'Reilly Media, 2020.Disponível em:</w:t>
@@ -17440,6 +17508,8 @@
       </w:hyperlink>
       <w:r>
         <w:rPr>
+          <w:rFonts w:ascii="Arial" w:hAnsi="Arial"/>
+          <w:sz w:val="24"/>
           <w:rtl w:val="0"/>
         </w:rPr>
         <w:t xml:space="preserve"> </w:t>
@@ -17454,20 +17524,26 @@
       </w:pPr>
       <w:r>
         <w:rPr>
+          <w:rFonts w:ascii="Arial" w:hAnsi="Arial"/>
+          <w:sz w:val="24"/>
           <w:rtl w:val="0"/>
         </w:rPr>
         <w:t xml:space="preserve">BECK, K. et al. </w:t>
       </w:r>
       <w:r>
         <w:rPr>
+          <w:rFonts w:ascii="Arial" w:hAnsi="Arial"/>
           <w:b w:val="1"/>
           <w:bCs w:val="1"/>
+          <w:sz w:val="24"/>
           <w:rtl w:val="0"/>
         </w:rPr>
         <w:t xml:space="preserve">Manifesto for Agile Software Development</w:t>
       </w:r>
       <w:r>
         <w:rPr>
+          <w:rFonts w:ascii="Arial" w:hAnsi="Arial"/>
+          <w:sz w:val="24"/>
           <w:rtl w:val="0"/>
         </w:rPr>
         <w:t xml:space="preserve">. 2001. Disponível em:</w:t>
@@ -17492,6 +17568,8 @@
       </w:hyperlink>
       <w:r>
         <w:rPr>
+          <w:rFonts w:ascii="Arial" w:hAnsi="Arial"/>
+          <w:sz w:val="24"/>
           <w:rtl w:val="0"/>
         </w:rPr>
         <w:t xml:space="preserve">. Acesso em: 16 nov. 2025.</w:t>
@@ -17504,6 +17582,10 @@
         <w:jc w:val="left"/>
       </w:pPr>
       <w:r>
+        <w:rPr>
+          <w:rFonts w:ascii="Arial" w:hAnsi="Arial"/>
+          <w:sz w:val="24"/>
+        </w:rPr>
         <w:t>BRASIL. Agência Nacional de Vigilância Sanitária. Resolução da Diretoria Colegiada - RDC nº 657, de 24 de março de 2022. Dispõe sobre a regularização de software como dispositivo médico. Brasília, DF: Anvisa, 2022. Disponível em: https://www.gov.br/anvisa/. Acesso em: 13 out. 2026.</w:t>
       </w:r>
     </w:p>
@@ -17514,6 +17596,10 @@
         <w:jc w:val="left"/>
       </w:pPr>
       <w:r>
+        <w:rPr>
+          <w:rFonts w:ascii="Arial" w:hAnsi="Arial"/>
+          <w:sz w:val="24"/>
+        </w:rPr>
         <w:t>BRASIL. Agência Nacional de Vigilância Sanitária. Software como dispositivo médico: perguntas e respostas. Brasília, DF: Anvisa, 2022. Disponível em: https://www.gov.br/anvisa/pt-br/centraisdeconteudo/publicacoes/produtos-para-a-saude/manuais/software-como-dispositivo-medico-perguntas-e-respostas. Acesso em: 13 out. 2026.</w:t>
       </w:r>
     </w:p>
@@ -17524,6 +17610,10 @@
         <w:jc w:val="left"/>
       </w:pPr>
       <w:r>
+        <w:rPr>
+          <w:rFonts w:ascii="Arial" w:hAnsi="Arial"/>
+          <w:sz w:val="24"/>
+        </w:rPr>
         <w:t>BRASIL. Governo Digital. Modelo de Acessibilidade em Governo Eletrônico - eMAG, versão 3.1. Brasília, DF: Governo Federal. Disponível em: https://www.gov.br/governodigitallogin/pt-br/acessibilidade-e-usuario/acessibilidade-digital/modelo-de-acessibilidade. Acesso em: 13 out. 2026.</w:t>
       </w:r>
     </w:p>
@@ -17536,34 +17626,44 @@
       </w:pPr>
       <w:r>
         <w:rPr>
+          <w:rFonts w:ascii="Arial" w:hAnsi="Arial"/>
+          <w:sz w:val="24"/>
           <w:rtl w:val="0"/>
         </w:rPr>
         <w:t xml:space="preserve">CRAIK, A.; HE, Y.; CONTRERAS-VIDAL, J. L. </w:t>
       </w:r>
       <w:r>
         <w:rPr>
+          <w:rFonts w:ascii="Arial" w:hAnsi="Arial"/>
           <w:b w:val="1"/>
           <w:bCs w:val="1"/>
+          <w:sz w:val="24"/>
           <w:rtl w:val="0"/>
         </w:rPr>
         <w:t xml:space="preserve">Deep learning for electroencephalogram (EEG) classification tasks: a review</w:t>
       </w:r>
       <w:r>
         <w:rPr>
+          <w:rFonts w:ascii="Arial" w:hAnsi="Arial"/>
+          <w:sz w:val="24"/>
           <w:rtl w:val="0"/>
         </w:rPr>
         <w:t xml:space="preserve">. </w:t>
       </w:r>
       <w:r>
         <w:rPr>
+          <w:rFonts w:ascii="Arial" w:hAnsi="Arial"/>
           <w:i w:val="1"/>
           <w:iCs w:val="1"/>
+          <w:sz w:val="24"/>
           <w:rtl w:val="0"/>
         </w:rPr>
         <w:t xml:space="preserve">Journal of Neural Engineering</w:t>
       </w:r>
       <w:r>
         <w:rPr>
+          <w:rFonts w:ascii="Arial" w:hAnsi="Arial"/>
+          <w:sz w:val="24"/>
           <w:rtl w:val="0"/>
         </w:rPr>
         <w:t xml:space="preserve">, v. 16, n. 3, 2019. Disponível em:</w:t>
@@ -17590,7 +17690,8 @@
       </w:hyperlink>
       <w:r>
         <w:rPr>
-          <w:sz w:val="22"/>
+          <w:rFonts w:ascii="Arial" w:hAnsi="Arial"/>
+          <w:sz w:val="24"/>
           <w:szCs w:val="22"/>
           <w:rtl w:val="0"/>
         </w:rPr>
@@ -17598,6 +17699,8 @@
       </w:r>
       <w:r>
         <w:rPr>
+          <w:rFonts w:ascii="Arial" w:hAnsi="Arial"/>
+          <w:sz w:val="24"/>
           <w:rtl w:val="0"/>
         </w:rPr>
         <w:t xml:space="preserve">. Acesso em: 08 nov. 2025.</w:t>
@@ -17612,20 +17715,26 @@
       </w:pPr>
       <w:r>
         <w:rPr>
+          <w:rFonts w:ascii="Arial" w:hAnsi="Arial"/>
+          <w:sz w:val="24"/>
           <w:rtl w:val="0"/>
         </w:rPr>
         <w:t xml:space="preserve">ELMASRI, R.; NAVATHE, S. B. </w:t>
       </w:r>
       <w:r>
         <w:rPr>
+          <w:rFonts w:ascii="Arial" w:hAnsi="Arial"/>
           <w:b w:val="1"/>
           <w:bCs w:val="1"/>
+          <w:sz w:val="24"/>
           <w:rtl w:val="0"/>
         </w:rPr>
         <w:t xml:space="preserve">Fundamentals of Database Systems</w:t>
       </w:r>
       <w:r>
         <w:rPr>
+          <w:rFonts w:ascii="Arial" w:hAnsi="Arial"/>
+          <w:sz w:val="24"/>
           <w:rtl w:val="0"/>
         </w:rPr>
         <w:t xml:space="preserve">. 6. ed. Boston: Addison-Wesley, 2011.  Disponível em:</w:t>
@@ -17650,6 +17759,8 @@
       </w:hyperlink>
       <w:r>
         <w:rPr>
+          <w:rFonts w:ascii="Arial" w:hAnsi="Arial"/>
+          <w:sz w:val="24"/>
           <w:rtl w:val="0"/>
         </w:rPr>
         <w:t xml:space="preserve"> </w:t>
@@ -17664,34 +17775,44 @@
       </w:pPr>
       <w:r>
         <w:rPr>
+          <w:rFonts w:ascii="Arial" w:hAnsi="Arial"/>
+          <w:sz w:val="24"/>
           <w:rtl w:val="0"/>
         </w:rPr>
         <w:t xml:space="preserve">ESTEVA, A. et al. </w:t>
       </w:r>
       <w:r>
         <w:rPr>
+          <w:rFonts w:ascii="Arial" w:hAnsi="Arial"/>
           <w:b w:val="1"/>
           <w:bCs w:val="1"/>
+          <w:sz w:val="24"/>
           <w:rtl w:val="0"/>
         </w:rPr>
         <w:t xml:space="preserve">A guide to deep learning in healthcare</w:t>
       </w:r>
       <w:r>
         <w:rPr>
+          <w:rFonts w:ascii="Arial" w:hAnsi="Arial"/>
+          <w:sz w:val="24"/>
           <w:rtl w:val="0"/>
         </w:rPr>
         <w:t xml:space="preserve">. </w:t>
       </w:r>
       <w:r>
         <w:rPr>
+          <w:rFonts w:ascii="Arial" w:hAnsi="Arial"/>
           <w:i w:val="1"/>
           <w:iCs w:val="1"/>
+          <w:sz w:val="24"/>
           <w:rtl w:val="0"/>
         </w:rPr>
         <w:t xml:space="preserve">Nature Medicine</w:t>
       </w:r>
       <w:r>
         <w:rPr>
+          <w:rFonts w:ascii="Arial" w:hAnsi="Arial"/>
+          <w:sz w:val="24"/>
           <w:rtl w:val="0"/>
         </w:rPr>
         <w:t xml:space="preserve">, v. 25, n. 1, p. 24-29, 2019. Disponível em:</w:t>
@@ -17718,6 +17839,8 @@
       </w:hyperlink>
       <w:r>
         <w:rPr>
+          <w:rFonts w:ascii="Arial" w:hAnsi="Arial"/>
+          <w:sz w:val="24"/>
           <w:rtl w:val="0"/>
         </w:rPr>
         <w:t xml:space="preserve">. Acesso em: 09 nov. 2025.</w:t>
@@ -17732,34 +17855,44 @@
       </w:pPr>
       <w:r>
         <w:rPr>
+          <w:rFonts w:ascii="Arial" w:hAnsi="Arial"/>
+          <w:sz w:val="24"/>
           <w:rtl w:val="0"/>
         </w:rPr>
         <w:t xml:space="preserve">FAUST, O. et al. </w:t>
       </w:r>
       <w:r>
         <w:rPr>
+          <w:rFonts w:ascii="Arial" w:hAnsi="Arial"/>
           <w:b w:val="1"/>
           <w:bCs w:val="1"/>
+          <w:sz w:val="24"/>
           <w:rtl w:val="0"/>
         </w:rPr>
         <w:t xml:space="preserve">Deep learning for healthcare applications based on physiological signals: A review</w:t>
       </w:r>
       <w:r>
         <w:rPr>
+          <w:rFonts w:ascii="Arial" w:hAnsi="Arial"/>
+          <w:sz w:val="24"/>
           <w:rtl w:val="0"/>
         </w:rPr>
         <w:t xml:space="preserve">. </w:t>
       </w:r>
       <w:r>
         <w:rPr>
+          <w:rFonts w:ascii="Arial" w:hAnsi="Arial"/>
           <w:i w:val="1"/>
           <w:iCs w:val="1"/>
+          <w:sz w:val="24"/>
           <w:rtl w:val="0"/>
         </w:rPr>
         <w:t xml:space="preserve">Computer Methods and Programs in Biomedicine</w:t>
       </w:r>
       <w:r>
         <w:rPr>
+          <w:rFonts w:ascii="Arial" w:hAnsi="Arial"/>
+          <w:sz w:val="24"/>
           <w:rtl w:val="0"/>
         </w:rPr>
         <w:t xml:space="preserve">, v. 161, p. 1-13, 2018. Disponível em:</w:t>
@@ -17784,6 +17917,8 @@
       </w:hyperlink>
       <w:r>
         <w:rPr>
+          <w:rFonts w:ascii="Arial" w:hAnsi="Arial"/>
+          <w:sz w:val="24"/>
           <w:rtl w:val="0"/>
         </w:rPr>
         <w:t xml:space="preserve"> . Acesso em: 09 nov. 2025.</w:t>
@@ -17797,6 +17932,10 @@
         <w:rPr/>
       </w:pPr>
       <w:r>
+        <w:rPr>
+          <w:rFonts w:ascii="Arial" w:hAnsi="Arial"/>
+          <w:sz w:val="24"/>
+        </w:rPr>
         <w:t xml:space="preserve">FIELDING, R. T. Architectural Styles and the Design of Network-based Software Architectures. 2000. Tese (Doutorado em Ciência da Computação) - University of California, Irvine, 2000. Disponível em: https://roy.gbiv.com/pubs/dissertation/fielding_dissertation.pdf </w:t>
       </w:r>
     </w:p>
@@ -17809,20 +17948,26 @@
       </w:pPr>
       <w:r>
         <w:rPr>
+          <w:rFonts w:ascii="Arial" w:hAnsi="Arial"/>
+          <w:sz w:val="24"/>
           <w:rtl w:val="0"/>
         </w:rPr>
         <w:t xml:space="preserve">FOWLER, M. </w:t>
       </w:r>
       <w:r>
         <w:rPr>
+          <w:rFonts w:ascii="Arial" w:hAnsi="Arial"/>
           <w:b w:val="1"/>
           <w:bCs w:val="1"/>
+          <w:sz w:val="24"/>
           <w:rtl w:val="0"/>
         </w:rPr>
         <w:t xml:space="preserve">Refactoring: Improving the Design of Existing Code</w:t>
       </w:r>
       <w:r>
         <w:rPr>
+          <w:rFonts w:ascii="Arial" w:hAnsi="Arial"/>
+          <w:sz w:val="24"/>
           <w:rtl w:val="0"/>
         </w:rPr>
         <w:t xml:space="preserve">. 2. ed. Boston: Addison-Wesley, 2018. Disponível em:</w:t>
@@ -17847,6 +17992,8 @@
       </w:hyperlink>
       <w:r>
         <w:rPr>
+          <w:rFonts w:ascii="Arial" w:hAnsi="Arial"/>
+          <w:sz w:val="24"/>
           <w:rtl w:val="0"/>
         </w:rPr>
         <w:t xml:space="preserve"> </w:t>
@@ -17861,34 +18008,44 @@
       </w:pPr>
       <w:r>
         <w:rPr>
+          <w:rFonts w:ascii="Arial" w:hAnsi="Arial"/>
+          <w:sz w:val="24"/>
           <w:rtl w:val="0"/>
         </w:rPr>
         <w:t xml:space="preserve">GOLDBERGER, A. L. et al. </w:t>
       </w:r>
       <w:r>
         <w:rPr>
+          <w:rFonts w:ascii="Arial" w:hAnsi="Arial"/>
           <w:b w:val="1"/>
           <w:bCs w:val="1"/>
+          <w:sz w:val="24"/>
           <w:rtl w:val="0"/>
         </w:rPr>
         <w:t xml:space="preserve">PhysioBank, PhysioToolkit, and PhysioNet: components of a new research resource for complex physiologic signals</w:t>
       </w:r>
       <w:r>
         <w:rPr>
+          <w:rFonts w:ascii="Arial" w:hAnsi="Arial"/>
+          <w:sz w:val="24"/>
           <w:rtl w:val="0"/>
         </w:rPr>
         <w:t xml:space="preserve">. </w:t>
       </w:r>
       <w:r>
         <w:rPr>
+          <w:rFonts w:ascii="Arial" w:hAnsi="Arial"/>
           <w:i w:val="1"/>
           <w:iCs w:val="1"/>
+          <w:sz w:val="24"/>
           <w:rtl w:val="0"/>
         </w:rPr>
         <w:t xml:space="preserve">Circulation</w:t>
       </w:r>
       <w:r>
         <w:rPr>
+          <w:rFonts w:ascii="Arial" w:hAnsi="Arial"/>
+          <w:sz w:val="24"/>
           <w:rtl w:val="0"/>
         </w:rPr>
         <w:t xml:space="preserve">, v. 101, n. 23, p. e215-e220, 2000. Disponível em:</w:t>
@@ -17913,6 +18070,8 @@
       </w:hyperlink>
       <w:r>
         <w:rPr>
+          <w:rFonts w:ascii="Arial" w:hAnsi="Arial"/>
+          <w:sz w:val="24"/>
           <w:rtl w:val="0"/>
         </w:rPr>
         <w:t xml:space="preserve"> . Acesso em: 10 nov. 2025.</w:t>
@@ -17926,6 +18085,10 @@
         <w:rPr/>
       </w:pPr>
       <w:r>
+        <w:rPr>
+          <w:rFonts w:ascii="Arial" w:hAnsi="Arial"/>
+          <w:sz w:val="24"/>
+        </w:rPr>
         <w:t>GRAMFORT, A. et al. MEG and EEG data analysis with MNE-Python. Frontiers in Neuroscience, v. 7, p. 267, 2013. Disponível em: https://www.frontiersin.org/journals/neuroscience/articles/10.3389/fnins.2013.00267/full. Acesso em: 10 nov. 2025.</w:t>
       </w:r>
     </w:p>
@@ -17938,20 +18101,26 @@
       </w:pPr>
       <w:r>
         <w:rPr>
+          <w:rFonts w:ascii="Arial" w:hAnsi="Arial"/>
+          <w:sz w:val="24"/>
           <w:rtl w:val="0"/>
         </w:rPr>
         <w:t xml:space="preserve">GROVES, P. et al. </w:t>
       </w:r>
       <w:r>
         <w:rPr>
+          <w:rFonts w:ascii="Arial" w:hAnsi="Arial"/>
           <w:b w:val="1"/>
           <w:bCs w:val="1"/>
+          <w:sz w:val="24"/>
           <w:rtl w:val="0"/>
         </w:rPr>
         <w:t xml:space="preserve">The 'Big Data' revolution in healthcare: Accelerating value and innovation</w:t>
       </w:r>
       <w:r>
         <w:rPr>
+          <w:rFonts w:ascii="Arial" w:hAnsi="Arial"/>
+          <w:sz w:val="24"/>
           <w:rtl w:val="0"/>
         </w:rPr>
         <w:t xml:space="preserve">. Center for US Health System Reform Business Technology Office. McKinsey &amp; Company, 2013. Disponível em:</w:t>
@@ -17976,6 +18145,8 @@
       </w:hyperlink>
       <w:r>
         <w:rPr>
+          <w:rFonts w:ascii="Arial" w:hAnsi="Arial"/>
+          <w:sz w:val="24"/>
           <w:rtl w:val="0"/>
         </w:rPr>
         <w:t xml:space="preserve">. Acesso em: 17 nov. 2025.</w:t>
@@ -17990,34 +18161,44 @@
       </w:pPr>
       <w:r>
         <w:rPr>
+          <w:rFonts w:ascii="Arial" w:hAnsi="Arial"/>
+          <w:sz w:val="24"/>
           <w:rtl w:val="0"/>
         </w:rPr>
         <w:t xml:space="preserve">GUNNING, D. et al. </w:t>
       </w:r>
       <w:r>
         <w:rPr>
+          <w:rFonts w:ascii="Arial" w:hAnsi="Arial"/>
           <w:b w:val="1"/>
           <w:bCs w:val="1"/>
+          <w:sz w:val="24"/>
           <w:rtl w:val="0"/>
         </w:rPr>
         <w:t xml:space="preserve">XAI—Explainable artificial intelligence</w:t>
       </w:r>
       <w:r>
         <w:rPr>
+          <w:rFonts w:ascii="Arial" w:hAnsi="Arial"/>
+          <w:sz w:val="24"/>
           <w:rtl w:val="0"/>
         </w:rPr>
         <w:t xml:space="preserve">. </w:t>
       </w:r>
       <w:r>
         <w:rPr>
+          <w:rFonts w:ascii="Arial" w:hAnsi="Arial"/>
           <w:i w:val="1"/>
           <w:iCs w:val="1"/>
+          <w:sz w:val="24"/>
           <w:rtl w:val="0"/>
         </w:rPr>
         <w:t xml:space="preserve">Science Robotics</w:t>
       </w:r>
       <w:r>
         <w:rPr>
+          <w:rFonts w:ascii="Arial" w:hAnsi="Arial"/>
+          <w:sz w:val="24"/>
           <w:rtl w:val="0"/>
         </w:rPr>
         <w:t xml:space="preserve">, v. 4, n. 37, 2019. Disponível em:</w:t>
@@ -18042,6 +18223,8 @@
       </w:hyperlink>
       <w:r>
         <w:rPr>
+          <w:rFonts w:ascii="Arial" w:hAnsi="Arial"/>
+          <w:sz w:val="24"/>
           <w:rtl w:val="0"/>
         </w:rPr>
         <w:t xml:space="preserve"> . Acesso em: 11 nov. 2025.</w:t>
@@ -18056,20 +18239,26 @@
       </w:pPr>
       <w:r>
         <w:rPr>
+          <w:rFonts w:ascii="Arial" w:hAnsi="Arial"/>
+          <w:sz w:val="24"/>
           <w:rtl w:val="0"/>
         </w:rPr>
         <w:t xml:space="preserve">HERZOG, R. et al. </w:t>
       </w:r>
       <w:r>
         <w:rPr>
+          <w:rFonts w:ascii="Arial" w:hAnsi="Arial"/>
           <w:b w:val="1"/>
           <w:bCs w:val="1"/>
+          <w:sz w:val="24"/>
           <w:rtl w:val="0"/>
         </w:rPr>
         <w:t xml:space="preserve">Digital Healthcare: The impact of digital transformation</w:t>
       </w:r>
       <w:r>
         <w:rPr>
+          <w:rFonts w:ascii="Arial" w:hAnsi="Arial"/>
+          <w:sz w:val="24"/>
           <w:rtl w:val="0"/>
         </w:rPr>
         <w:t xml:space="preserve">. Springer, 2016. Disponível em: </w:t>
@@ -18086,6 +18275,8 @@
       </w:hyperlink>
       <w:r>
         <w:rPr>
+          <w:rFonts w:ascii="Arial" w:hAnsi="Arial"/>
+          <w:sz w:val="24"/>
           <w:rtl w:val="0"/>
         </w:rPr>
         <w:t xml:space="preserve"> </w:t>
@@ -18100,34 +18291,44 @@
       </w:pPr>
       <w:r>
         <w:rPr>
+          <w:rFonts w:ascii="Arial" w:hAnsi="Arial"/>
+          <w:sz w:val="24"/>
           <w:rtl w:val="0"/>
         </w:rPr>
         <w:t xml:space="preserve">HOCHREITER, S.; SCHMIDHUBER, J. </w:t>
       </w:r>
       <w:r>
         <w:rPr>
+          <w:rFonts w:ascii="Arial" w:hAnsi="Arial"/>
           <w:b w:val="1"/>
           <w:bCs w:val="1"/>
+          <w:sz w:val="24"/>
           <w:rtl w:val="0"/>
         </w:rPr>
         <w:t xml:space="preserve">Long short-term memory</w:t>
       </w:r>
       <w:r>
         <w:rPr>
+          <w:rFonts w:ascii="Arial" w:hAnsi="Arial"/>
+          <w:sz w:val="24"/>
           <w:rtl w:val="0"/>
         </w:rPr>
         <w:t xml:space="preserve">. </w:t>
       </w:r>
       <w:r>
         <w:rPr>
+          <w:rFonts w:ascii="Arial" w:hAnsi="Arial"/>
           <w:i w:val="1"/>
           <w:iCs w:val="1"/>
+          <w:sz w:val="24"/>
           <w:rtl w:val="0"/>
         </w:rPr>
         <w:t xml:space="preserve">Neural Computation</w:t>
       </w:r>
       <w:r>
         <w:rPr>
+          <w:rFonts w:ascii="Arial" w:hAnsi="Arial"/>
+          <w:sz w:val="24"/>
           <w:rtl w:val="0"/>
         </w:rPr>
         <w:t xml:space="preserve">, v. 9, n. 8, p. 1735-1780, 1997. Disponível em:</w:t>
@@ -18154,6 +18355,8 @@
       </w:hyperlink>
       <w:r>
         <w:rPr>
+          <w:rFonts w:ascii="Arial" w:hAnsi="Arial"/>
+          <w:sz w:val="24"/>
           <w:rtl w:val="0"/>
         </w:rPr>
         <w:t xml:space="preserve">. Acesso em: 11 nov. 2025.</w:t>
@@ -18168,20 +18371,26 @@
       </w:pPr>
       <w:r>
         <w:rPr>
+          <w:rFonts w:ascii="Arial" w:hAnsi="Arial"/>
+          <w:sz w:val="24"/>
           <w:rtl w:val="0"/>
         </w:rPr>
         <w:t xml:space="preserve">KLEPPMANN, M. </w:t>
       </w:r>
       <w:r>
         <w:rPr>
+          <w:rFonts w:ascii="Arial" w:hAnsi="Arial"/>
           <w:b w:val="1"/>
           <w:bCs w:val="1"/>
+          <w:sz w:val="24"/>
           <w:rtl w:val="0"/>
         </w:rPr>
         <w:t xml:space="preserve">Designing Data-Intensive Applications</w:t>
       </w:r>
       <w:r>
         <w:rPr>
+          <w:rFonts w:ascii="Arial" w:hAnsi="Arial"/>
+          <w:sz w:val="24"/>
           <w:rtl w:val="0"/>
         </w:rPr>
         <w:t xml:space="preserve">. Sebastopol: O'Reilly Media, 2017. Disponível em: </w:t>
@@ -18198,6 +18407,8 @@
       </w:hyperlink>
       <w:r>
         <w:rPr>
+          <w:rFonts w:ascii="Arial" w:hAnsi="Arial"/>
+          <w:sz w:val="24"/>
           <w:rtl w:val="0"/>
         </w:rPr>
         <w:t xml:space="preserve"> </w:t>
@@ -18212,34 +18423,44 @@
       </w:pPr>
       <w:r>
         <w:rPr>
+          <w:rFonts w:ascii="Arial" w:hAnsi="Arial"/>
+          <w:sz w:val="24"/>
           <w:rtl w:val="0"/>
         </w:rPr>
         <w:t xml:space="preserve">LECUN, Y.; BENGIO, Y.; HINTON, G. </w:t>
       </w:r>
       <w:r>
         <w:rPr>
+          <w:rFonts w:ascii="Arial" w:hAnsi="Arial"/>
           <w:b w:val="1"/>
           <w:bCs w:val="1"/>
+          <w:sz w:val="24"/>
           <w:rtl w:val="0"/>
         </w:rPr>
         <w:t xml:space="preserve">Deep learning</w:t>
       </w:r>
       <w:r>
         <w:rPr>
+          <w:rFonts w:ascii="Arial" w:hAnsi="Arial"/>
+          <w:sz w:val="24"/>
           <w:rtl w:val="0"/>
         </w:rPr>
         <w:t xml:space="preserve">. </w:t>
       </w:r>
       <w:r>
         <w:rPr>
+          <w:rFonts w:ascii="Arial" w:hAnsi="Arial"/>
           <w:i w:val="1"/>
           <w:iCs w:val="1"/>
+          <w:sz w:val="24"/>
           <w:rtl w:val="0"/>
         </w:rPr>
         <w:t xml:space="preserve">Nature</w:t>
       </w:r>
       <w:r>
         <w:rPr>
+          <w:rFonts w:ascii="Arial" w:hAnsi="Arial"/>
+          <w:sz w:val="24"/>
           <w:rtl w:val="0"/>
         </w:rPr>
         <w:t xml:space="preserve">, v. 521, p. 436-444, 2015. Disponível em:</w:t>
@@ -18266,6 +18487,8 @@
       </w:hyperlink>
       <w:r>
         <w:rPr>
+          <w:rFonts w:ascii="Arial" w:hAnsi="Arial"/>
+          <w:sz w:val="24"/>
           <w:rtl w:val="0"/>
         </w:rPr>
         <w:t xml:space="preserve">. Acesso em: 12 nov. 2025.</w:t>
@@ -18280,20 +18503,26 @@
       </w:pPr>
       <w:r>
         <w:rPr>
+          <w:rFonts w:ascii="Arial" w:hAnsi="Arial"/>
+          <w:sz w:val="24"/>
           <w:rtl w:val="0"/>
         </w:rPr>
         <w:t xml:space="preserve">LUNDBERG, S. M.; LEE, S.-I. </w:t>
       </w:r>
       <w:r>
         <w:rPr>
+          <w:rFonts w:ascii="Arial" w:hAnsi="Arial"/>
           <w:b w:val="1"/>
           <w:bCs w:val="1"/>
+          <w:sz w:val="24"/>
           <w:rtl w:val="0"/>
         </w:rPr>
         <w:t xml:space="preserve">A unified approach to interpreting model predictions</w:t>
       </w:r>
       <w:r>
         <w:rPr>
+          <w:rFonts w:ascii="Arial" w:hAnsi="Arial"/>
+          <w:sz w:val="24"/>
           <w:rtl w:val="0"/>
         </w:rPr>
         <w:t xml:space="preserve">. In: ADVANCES IN NEURAL INFORMATION PROCESSING SYSTEMS, 30. Anais... Long Beach, CA: NeurIPS, 2017. Disponível em:</w:t>
@@ -18320,7 +18549,8 @@
       </w:hyperlink>
       <w:r>
         <w:rPr>
-          <w:sz w:val="22"/>
+          <w:rFonts w:ascii="Arial" w:hAnsi="Arial"/>
+          <w:sz w:val="24"/>
           <w:szCs w:val="22"/>
           <w:rtl w:val="0"/>
         </w:rPr>
@@ -18328,6 +18558,8 @@
       </w:r>
       <w:r>
         <w:rPr>
+          <w:rFonts w:ascii="Arial" w:hAnsi="Arial"/>
+          <w:sz w:val="24"/>
           <w:rtl w:val="0"/>
         </w:rPr>
         <w:t xml:space="preserve">. Acesso em: 12 nov. 2025.</w:t>
@@ -18342,20 +18574,26 @@
       </w:pPr>
       <w:r>
         <w:rPr>
+          <w:rFonts w:ascii="Arial" w:hAnsi="Arial"/>
+          <w:sz w:val="24"/>
           <w:rtl w:val="0"/>
         </w:rPr>
         <w:t xml:space="preserve">MCKINNEY, W. </w:t>
       </w:r>
       <w:r>
         <w:rPr>
+          <w:rFonts w:ascii="Arial" w:hAnsi="Arial"/>
           <w:b w:val="1"/>
           <w:bCs w:val="1"/>
+          <w:sz w:val="24"/>
           <w:rtl w:val="0"/>
         </w:rPr>
         <w:t xml:space="preserve">Python for Data Analysis</w:t>
       </w:r>
       <w:r>
         <w:rPr>
+          <w:rFonts w:ascii="Arial" w:hAnsi="Arial"/>
+          <w:sz w:val="24"/>
           <w:rtl w:val="0"/>
         </w:rPr>
         <w:t xml:space="preserve">. Sebastopol: O'Reilly Media, 2012.</w:t>
@@ -18369,6 +18607,10 @@
         <w:rPr/>
       </w:pPr>
       <w:r>
+        <w:rPr>
+          <w:rFonts w:ascii="Arial" w:hAnsi="Arial"/>
+          <w:sz w:val="24"/>
+        </w:rPr>
         <w:t>META PLATFORMS. React: the library for web and native user interfaces. Disponível em: https://react.dev/. Acesso em: 13 out. 2026.</w:t>
       </w:r>
     </w:p>
@@ -18381,20 +18623,26 @@
       </w:pPr>
       <w:r>
         <w:rPr>
+          <w:rFonts w:ascii="Arial" w:hAnsi="Arial"/>
+          <w:sz w:val="24"/>
           <w:rtl w:val="0"/>
         </w:rPr>
         <w:t xml:space="preserve">MOREIRA, Karollyne Evangelista; MARQUES, Eduardo Henrique Guimarães; TORQUATO, Thiane Marques; SOUZA, Lynwood Livi de. </w:t>
       </w:r>
       <w:r>
         <w:rPr>
+          <w:rFonts w:ascii="Arial" w:hAnsi="Arial"/>
           <w:b w:val="1"/>
           <w:bCs w:val="1"/>
+          <w:sz w:val="24"/>
           <w:rtl w:val="0"/>
         </w:rPr>
         <w:t xml:space="preserve">Identificação de Padrões Genéticos para Diagnóstico de Doenças Utilizando Inteligência Artificial</w:t>
       </w:r>
       <w:r>
         <w:rPr>
+          <w:rFonts w:ascii="Arial" w:hAnsi="Arial"/>
+          <w:sz w:val="24"/>
           <w:rtl w:val="0"/>
         </w:rPr>
         <w:t xml:space="preserve"> (Relatório Final de Iniciação em Desenvolvimento Tecnológico e Inovação - PIBITI). Uruaçu: Instituto Federal de Educação, Ciência e Tecnologia de Goiás (IFG), 2025.</w:t>
@@ -18409,20 +18657,26 @@
       </w:pPr>
       <w:r>
         <w:rPr>
+          <w:rFonts w:ascii="Arial" w:hAnsi="Arial"/>
+          <w:sz w:val="24"/>
           <w:rtl w:val="0"/>
         </w:rPr>
         <w:t xml:space="preserve">NEWMAN, S. </w:t>
       </w:r>
       <w:r>
         <w:rPr>
+          <w:rFonts w:ascii="Arial" w:hAnsi="Arial"/>
           <w:b w:val="1"/>
           <w:bCs w:val="1"/>
+          <w:sz w:val="24"/>
           <w:rtl w:val="0"/>
         </w:rPr>
         <w:t xml:space="preserve">Building Microservices: Designing Fine-Grained Systems</w:t>
       </w:r>
       <w:r>
         <w:rPr>
+          <w:rFonts w:ascii="Arial" w:hAnsi="Arial"/>
+          <w:sz w:val="24"/>
           <w:rtl w:val="0"/>
         </w:rPr>
         <w:t xml:space="preserve">. 2. ed. Sebastopol: O'Reilly Media, 2021. Disponível em: </w:t>
@@ -18439,6 +18693,8 @@
       </w:hyperlink>
       <w:r>
         <w:rPr>
+          <w:rFonts w:ascii="Arial" w:hAnsi="Arial"/>
+          <w:sz w:val="24"/>
           <w:rtl w:val="0"/>
         </w:rPr>
         <w:t xml:space="preserve">  </w:t>
@@ -18453,20 +18709,26 @@
       </w:pPr>
       <w:r>
         <w:rPr>
+          <w:rFonts w:ascii="Arial" w:hAnsi="Arial"/>
+          <w:sz w:val="24"/>
           <w:rtl w:val="0"/>
         </w:rPr>
         <w:t xml:space="preserve">NIEDERMEYER, E.; LOPES DA SILVA, F. H. </w:t>
       </w:r>
       <w:r>
         <w:rPr>
+          <w:rFonts w:ascii="Arial" w:hAnsi="Arial"/>
           <w:b w:val="1"/>
           <w:bCs w:val="1"/>
+          <w:sz w:val="24"/>
           <w:rtl w:val="0"/>
         </w:rPr>
         <w:t xml:space="preserve">Electroencephalography: Basic Principles, Clinical Applications, and Related Fields</w:t>
       </w:r>
       <w:r>
         <w:rPr>
+          <w:rFonts w:ascii="Arial" w:hAnsi="Arial"/>
+          <w:sz w:val="24"/>
           <w:rtl w:val="0"/>
         </w:rPr>
         <w:t xml:space="preserve">. 5. ed. Philadelphia: Lippincott Williams &amp; Wilkins, 2005. Disponível em: </w:t>
@@ -18483,6 +18745,8 @@
       </w:hyperlink>
       <w:r>
         <w:rPr>
+          <w:rFonts w:ascii="Arial" w:hAnsi="Arial"/>
+          <w:sz w:val="24"/>
           <w:rtl w:val="0"/>
         </w:rPr>
         <w:t xml:space="preserve"> </w:t>
@@ -18497,20 +18761,26 @@
       </w:pPr>
       <w:r>
         <w:rPr>
+          <w:rFonts w:ascii="Arial" w:hAnsi="Arial"/>
+          <w:sz w:val="24"/>
           <w:rtl w:val="0"/>
         </w:rPr>
         <w:t xml:space="preserve">PRESSMAN, R. S.; MAXIM, B. R. </w:t>
       </w:r>
       <w:r>
         <w:rPr>
+          <w:rFonts w:ascii="Arial" w:hAnsi="Arial"/>
           <w:b w:val="1"/>
           <w:bCs w:val="1"/>
+          <w:sz w:val="24"/>
           <w:rtl w:val="0"/>
         </w:rPr>
         <w:t xml:space="preserve">Engenharia de Software: Uma Abordagem Profissional</w:t>
       </w:r>
       <w:r>
         <w:rPr>
+          <w:rFonts w:ascii="Arial" w:hAnsi="Arial"/>
+          <w:sz w:val="24"/>
           <w:rtl w:val="0"/>
         </w:rPr>
         <w:t xml:space="preserve">. 8. ed. Porto Alegre: AMGH, 2016.</w:t>
@@ -18525,34 +18795,44 @@
       </w:pPr>
       <w:r>
         <w:rPr>
+          <w:rFonts w:ascii="Arial" w:hAnsi="Arial"/>
+          <w:sz w:val="24"/>
           <w:rtl w:val="0"/>
         </w:rPr>
         <w:t xml:space="preserve">RAGHUPATHI, W.; RAGHUPATHI, V. </w:t>
       </w:r>
       <w:r>
         <w:rPr>
+          <w:rFonts w:ascii="Arial" w:hAnsi="Arial"/>
           <w:b w:val="1"/>
           <w:bCs w:val="1"/>
+          <w:sz w:val="24"/>
           <w:rtl w:val="0"/>
         </w:rPr>
         <w:t xml:space="preserve">Big data analytics in healthcare: promise and potential</w:t>
       </w:r>
       <w:r>
         <w:rPr>
+          <w:rFonts w:ascii="Arial" w:hAnsi="Arial"/>
+          <w:sz w:val="24"/>
           <w:rtl w:val="0"/>
         </w:rPr>
         <w:t xml:space="preserve">. </w:t>
       </w:r>
       <w:r>
         <w:rPr>
+          <w:rFonts w:ascii="Arial" w:hAnsi="Arial"/>
           <w:i w:val="1"/>
           <w:iCs w:val="1"/>
+          <w:sz w:val="24"/>
           <w:rtl w:val="0"/>
         </w:rPr>
         <w:t xml:space="preserve">Health Information Science and Systems</w:t>
       </w:r>
       <w:r>
         <w:rPr>
+          <w:rFonts w:ascii="Arial" w:hAnsi="Arial"/>
+          <w:sz w:val="24"/>
           <w:rtl w:val="0"/>
         </w:rPr>
         <w:t xml:space="preserve">, v. 2, n. 3, 2014. Disponível em:</w:t>
@@ -18577,6 +18857,8 @@
       </w:hyperlink>
       <w:r>
         <w:rPr>
+          <w:rFonts w:ascii="Arial" w:hAnsi="Arial"/>
+          <w:sz w:val="24"/>
           <w:rtl w:val="0"/>
         </w:rPr>
         <w:t xml:space="preserve"> . Acesso em: 13 nov. 2025.</w:t>
@@ -18591,20 +18873,26 @@
       </w:pPr>
       <w:r>
         <w:rPr>
+          <w:rFonts w:ascii="Arial" w:hAnsi="Arial"/>
+          <w:sz w:val="24"/>
           <w:rtl w:val="0"/>
         </w:rPr>
         <w:t xml:space="preserve">RAMÍREZ, S. </w:t>
       </w:r>
       <w:r>
         <w:rPr>
+          <w:rFonts w:ascii="Arial" w:hAnsi="Arial"/>
           <w:b w:val="1"/>
           <w:bCs w:val="1"/>
+          <w:sz w:val="24"/>
           <w:rtl w:val="0"/>
         </w:rPr>
         <w:t xml:space="preserve">FastAPI</w:t>
       </w:r>
       <w:r>
         <w:rPr>
+          <w:rFonts w:ascii="Arial" w:hAnsi="Arial"/>
+          <w:sz w:val="24"/>
           <w:rtl w:val="0"/>
         </w:rPr>
         <w:t xml:space="preserve">. Disponível em:</w:t>
@@ -18629,6 +18917,8 @@
       </w:hyperlink>
       <w:r>
         <w:rPr>
+          <w:rFonts w:ascii="Arial" w:hAnsi="Arial"/>
+          <w:sz w:val="24"/>
           <w:rtl w:val="0"/>
         </w:rPr>
         <w:t xml:space="preserve">. Acesso em: 18 nov. 2025.</w:t>
@@ -18642,6 +18932,10 @@
         <w:rPr/>
       </w:pPr>
       <w:r>
+        <w:rPr>
+          <w:rFonts w:ascii="Arial" w:hAnsi="Arial"/>
+          <w:sz w:val="24"/>
+        </w:rPr>
         <w:t>REISMAN, M. EHRs: the challenge of making electronic data usable and interoperable. Pharmacy and Therapeutics, v. 42, n. 9, p. 572-575, 2017. Disponível em: https://pmc.ncbi.nlm.nih.gov/articles/PMC5565131/. Acesso em: 13 out. 2026.</w:t>
       </w:r>
     </w:p>
@@ -18654,20 +18948,26 @@
       </w:pPr>
       <w:r>
         <w:rPr>
+          <w:rFonts w:ascii="Arial" w:hAnsi="Arial"/>
+          <w:sz w:val="24"/>
           <w:rtl w:val="0"/>
         </w:rPr>
         <w:t xml:space="preserve">RICHARDS, M. </w:t>
       </w:r>
       <w:r>
         <w:rPr>
+          <w:rFonts w:ascii="Arial" w:hAnsi="Arial"/>
           <w:b w:val="1"/>
           <w:bCs w:val="1"/>
+          <w:sz w:val="24"/>
           <w:rtl w:val="0"/>
         </w:rPr>
         <w:t xml:space="preserve">Software Architecture Patterns</w:t>
       </w:r>
       <w:r>
         <w:rPr>
+          <w:rFonts w:ascii="Arial" w:hAnsi="Arial"/>
+          <w:sz w:val="24"/>
           <w:rtl w:val="0"/>
         </w:rPr>
         <w:t xml:space="preserve">. Sebastopol: O'Reilly Media, 2015.</w:t>
@@ -18682,34 +18982,44 @@
       </w:pPr>
       <w:r>
         <w:rPr>
+          <w:rFonts w:ascii="Arial" w:hAnsi="Arial"/>
+          <w:sz w:val="24"/>
           <w:rtl w:val="0"/>
         </w:rPr>
         <w:t xml:space="preserve">ROY, Y. et al. </w:t>
       </w:r>
       <w:r>
         <w:rPr>
+          <w:rFonts w:ascii="Arial" w:hAnsi="Arial"/>
           <w:b w:val="1"/>
           <w:bCs w:val="1"/>
+          <w:sz w:val="24"/>
           <w:rtl w:val="0"/>
         </w:rPr>
         <w:t xml:space="preserve">Deep learning-based electroencephalography analysis: a comprehensive review</w:t>
       </w:r>
       <w:r>
         <w:rPr>
+          <w:rFonts w:ascii="Arial" w:hAnsi="Arial"/>
+          <w:sz w:val="24"/>
           <w:rtl w:val="0"/>
         </w:rPr>
         <w:t xml:space="preserve">. </w:t>
       </w:r>
       <w:r>
         <w:rPr>
+          <w:rFonts w:ascii="Arial" w:hAnsi="Arial"/>
           <w:i w:val="1"/>
           <w:iCs w:val="1"/>
+          <w:sz w:val="24"/>
           <w:rtl w:val="0"/>
         </w:rPr>
         <w:t xml:space="preserve">Journal of Neural Engineering</w:t>
       </w:r>
       <w:r>
         <w:rPr>
+          <w:rFonts w:ascii="Arial" w:hAnsi="Arial"/>
+          <w:sz w:val="24"/>
           <w:rtl w:val="0"/>
         </w:rPr>
         <w:t xml:space="preserve">, v. 16, n. 5, 2019. Disponível em:</w:t>
@@ -18736,7 +19046,8 @@
       </w:hyperlink>
       <w:r>
         <w:rPr>
-          <w:sz w:val="22"/>
+          <w:rFonts w:ascii="Arial" w:hAnsi="Arial"/>
+          <w:sz w:val="24"/>
           <w:szCs w:val="22"/>
           <w:rtl w:val="0"/>
         </w:rPr>
@@ -18744,6 +19055,8 @@
       </w:r>
       <w:r>
         <w:rPr>
+          <w:rFonts w:ascii="Arial" w:hAnsi="Arial"/>
+          <w:sz w:val="24"/>
           <w:rtl w:val="0"/>
         </w:rPr>
         <w:t xml:space="preserve">. Acesso em: 14 nov. 2025.</w:t>
@@ -18758,34 +19071,44 @@
       </w:pPr>
       <w:r>
         <w:rPr>
+          <w:rFonts w:ascii="Arial" w:hAnsi="Arial"/>
+          <w:sz w:val="24"/>
           <w:rtl w:val="0"/>
         </w:rPr>
         <w:t xml:space="preserve">SHANNON, C. E. </w:t>
       </w:r>
       <w:r>
         <w:rPr>
+          <w:rFonts w:ascii="Arial" w:hAnsi="Arial"/>
           <w:b w:val="1"/>
           <w:bCs w:val="1"/>
+          <w:sz w:val="24"/>
           <w:rtl w:val="0"/>
         </w:rPr>
         <w:t xml:space="preserve">A mathematical theory of communication</w:t>
       </w:r>
       <w:r>
         <w:rPr>
+          <w:rFonts w:ascii="Arial" w:hAnsi="Arial"/>
+          <w:sz w:val="24"/>
           <w:rtl w:val="0"/>
         </w:rPr>
         <w:t xml:space="preserve">. </w:t>
       </w:r>
       <w:r>
         <w:rPr>
+          <w:rFonts w:ascii="Arial" w:hAnsi="Arial"/>
           <w:i w:val="1"/>
           <w:iCs w:val="1"/>
+          <w:sz w:val="24"/>
           <w:rtl w:val="0"/>
         </w:rPr>
         <w:t xml:space="preserve">The Bell System Technical Journal</w:t>
       </w:r>
       <w:r>
         <w:rPr>
+          <w:rFonts w:ascii="Arial" w:hAnsi="Arial"/>
+          <w:sz w:val="24"/>
           <w:rtl w:val="0"/>
         </w:rPr>
         <w:t xml:space="preserve">, v. 27, n. 3, p. 379–423, 1948. Disponível em:</w:t>
@@ -18812,7 +19135,8 @@
       </w:hyperlink>
       <w:r>
         <w:rPr>
-          <w:sz w:val="22"/>
+          <w:rFonts w:ascii="Arial" w:hAnsi="Arial"/>
+          <w:sz w:val="24"/>
           <w:szCs w:val="22"/>
           <w:rtl w:val="0"/>
         </w:rPr>
@@ -18820,6 +19144,8 @@
       </w:r>
       <w:r>
         <w:rPr>
+          <w:rFonts w:ascii="Arial" w:hAnsi="Arial"/>
+          <w:sz w:val="24"/>
           <w:rtl w:val="0"/>
         </w:rPr>
         <w:t xml:space="preserve">. Acesso em: 14 nov. 2025.</w:t>
@@ -18832,6 +19158,10 @@
         <w:jc w:val="left"/>
       </w:pPr>
       <w:r>
+        <w:rPr>
+          <w:rFonts w:ascii="Arial" w:hAnsi="Arial"/>
+          <w:sz w:val="24"/>
+        </w:rPr>
         <w:t>SHOEB, A. H. Application of machine learning to epileptic seizure onset detection and treatment. 2009. Tese (Doutorado) - Massachusetts Institute of Technology, Cambridge, 2009.</w:t>
       </w:r>
     </w:p>
@@ -18844,20 +19174,26 @@
       </w:pPr>
       <w:r>
         <w:rPr>
+          <w:rFonts w:ascii="Arial" w:hAnsi="Arial"/>
+          <w:sz w:val="24"/>
           <w:rtl w:val="0"/>
         </w:rPr>
         <w:t xml:space="preserve">SOMMERVILLE, I. </w:t>
       </w:r>
       <w:r>
         <w:rPr>
+          <w:rFonts w:ascii="Arial" w:hAnsi="Arial"/>
           <w:b w:val="1"/>
           <w:bCs w:val="1"/>
+          <w:sz w:val="24"/>
           <w:rtl w:val="0"/>
         </w:rPr>
         <w:t xml:space="preserve">Software Engineering</w:t>
       </w:r>
       <w:r>
         <w:rPr>
+          <w:rFonts w:ascii="Arial" w:hAnsi="Arial"/>
+          <w:sz w:val="24"/>
           <w:rtl w:val="0"/>
         </w:rPr>
         <w:t xml:space="preserve">. 9. ed. Boston: Addison-Wesley, 2011.</w:t>
@@ -18871,6 +19207,10 @@
         <w:rPr/>
       </w:pPr>
       <w:r>
+        <w:rPr>
+          <w:rFonts w:ascii="Arial" w:hAnsi="Arial"/>
+          <w:sz w:val="24"/>
+        </w:rPr>
         <w:t>SUTTON, R. T. et al. An overview of clinical decision support systems: benefits, risks, and strategies for success. NPJ Digital Medicine, v. 3, n. 17, 2020. Disponível em: https://www.nature.com/articles/s41746-020-0221-y . Acesso em: 15 nov. 2025.</w:t>
       </w:r>
     </w:p>
@@ -18883,20 +19223,26 @@
       </w:pPr>
       <w:r>
         <w:rPr>
+          <w:rFonts w:ascii="Arial" w:hAnsi="Arial"/>
+          <w:sz w:val="24"/>
           <w:rtl w:val="0"/>
         </w:rPr>
         <w:t xml:space="preserve">TATUM, W. O. et al. </w:t>
       </w:r>
       <w:r>
         <w:rPr>
+          <w:rFonts w:ascii="Arial" w:hAnsi="Arial"/>
           <w:b w:val="1"/>
           <w:bCs w:val="1"/>
+          <w:sz w:val="24"/>
           <w:rtl w:val="0"/>
         </w:rPr>
         <w:t xml:space="preserve">Harper's Hospital Handbook. Handbook of EEG Interpretation</w:t>
       </w:r>
       <w:r>
         <w:rPr>
+          <w:rFonts w:ascii="Arial" w:hAnsi="Arial"/>
+          <w:sz w:val="24"/>
           <w:rtl w:val="0"/>
         </w:rPr>
         <w:t xml:space="preserve">. 2. ed. Demos Medical Publishing, 2018.</w:t>
@@ -18911,34 +19257,44 @@
       </w:pPr>
       <w:r>
         <w:rPr>
+          <w:rFonts w:ascii="Arial" w:hAnsi="Arial"/>
+          <w:sz w:val="24"/>
           <w:rtl w:val="0"/>
         </w:rPr>
         <w:t xml:space="preserve">TOPOL, E. J. </w:t>
       </w:r>
       <w:r>
         <w:rPr>
+          <w:rFonts w:ascii="Arial" w:hAnsi="Arial"/>
           <w:b w:val="1"/>
           <w:bCs w:val="1"/>
+          <w:sz w:val="24"/>
           <w:rtl w:val="0"/>
         </w:rPr>
         <w:t xml:space="preserve">High-performance medicine: the convergence of human and artificial intelligence</w:t>
       </w:r>
       <w:r>
         <w:rPr>
+          <w:rFonts w:ascii="Arial" w:hAnsi="Arial"/>
+          <w:sz w:val="24"/>
           <w:rtl w:val="0"/>
         </w:rPr>
         <w:t xml:space="preserve">. </w:t>
       </w:r>
       <w:r>
         <w:rPr>
+          <w:rFonts w:ascii="Arial" w:hAnsi="Arial"/>
           <w:i w:val="1"/>
           <w:iCs w:val="1"/>
+          <w:sz w:val="24"/>
           <w:rtl w:val="0"/>
         </w:rPr>
         <w:t xml:space="preserve">Nature Medicine</w:t>
       </w:r>
       <w:r>
         <w:rPr>
+          <w:rFonts w:ascii="Arial" w:hAnsi="Arial"/>
+          <w:sz w:val="24"/>
           <w:rtl w:val="0"/>
         </w:rPr>
         <w:t xml:space="preserve">, v. 25, p. 44-56, 2019. Disponível em:</w:t>
@@ -18963,6 +19319,8 @@
       </w:hyperlink>
       <w:r>
         <w:rPr>
+          <w:rFonts w:ascii="Arial" w:hAnsi="Arial"/>
+          <w:sz w:val="24"/>
           <w:rtl w:val="0"/>
         </w:rPr>
         <w:t xml:space="preserve"> . Acesso em: 15 nov. 2025.</w:t>
@@ -18977,20 +19335,26 @@
       </w:pPr>
       <w:r>
         <w:rPr>
+          <w:rFonts w:ascii="Arial" w:hAnsi="Arial"/>
+          <w:sz w:val="24"/>
           <w:rtl w:val="0"/>
         </w:rPr>
         <w:t xml:space="preserve">VAN ROSSUM, G.; DRAKE, F. L. </w:t>
       </w:r>
       <w:r>
         <w:rPr>
+          <w:rFonts w:ascii="Arial" w:hAnsi="Arial"/>
           <w:b w:val="1"/>
           <w:bCs w:val="1"/>
+          <w:sz w:val="24"/>
           <w:rtl w:val="0"/>
         </w:rPr>
         <w:t xml:space="preserve">Python 3 Reference Manual</w:t>
       </w:r>
       <w:r>
         <w:rPr>
+          <w:rFonts w:ascii="Arial" w:hAnsi="Arial"/>
+          <w:sz w:val="24"/>
           <w:rtl w:val="0"/>
         </w:rPr>
         <w:t xml:space="preserve">. Scotts Valley, CA: CreateSpace, 2009.</w:t>
@@ -19005,20 +19369,26 @@
       </w:pPr>
       <w:r>
         <w:rPr>
+          <w:rFonts w:ascii="Arial" w:hAnsi="Arial"/>
+          <w:sz w:val="24"/>
           <w:rtl w:val="0"/>
         </w:rPr>
         <w:t xml:space="preserve">WHO - WORLD HEALTH ORGANIZATION. </w:t>
       </w:r>
       <w:r>
         <w:rPr>
+          <w:rFonts w:ascii="Arial" w:hAnsi="Arial"/>
           <w:b w:val="1"/>
           <w:bCs w:val="1"/>
+          <w:sz w:val="24"/>
           <w:rtl w:val="0"/>
         </w:rPr>
         <w:t xml:space="preserve">Epilepsy</w:t>
       </w:r>
       <w:r>
         <w:rPr>
+          <w:rFonts w:ascii="Arial" w:hAnsi="Arial"/>
+          <w:sz w:val="24"/>
           <w:rtl w:val="0"/>
         </w:rPr>
         <w:t xml:space="preserve">. 2024. Disponível em:</w:t>
@@ -19043,6 +19413,8 @@
       </w:hyperlink>
       <w:r>
         <w:rPr>
+          <w:rFonts w:ascii="Arial" w:hAnsi="Arial"/>
+          <w:sz w:val="24"/>
           <w:rtl w:val="0"/>
         </w:rPr>
         <w:t xml:space="preserve">. Acesso em: 17 nov. 2025.</w:t>
@@ -19057,34 +19429,44 @@
       </w:pPr>
       <w:r>
         <w:rPr>
+          <w:rFonts w:ascii="Arial" w:hAnsi="Arial"/>
+          <w:sz w:val="24"/>
           <w:rtl w:val="0"/>
         </w:rPr>
         <w:t xml:space="preserve">YAMASHITA, R. et al. </w:t>
       </w:r>
       <w:r>
         <w:rPr>
+          <w:rFonts w:ascii="Arial" w:hAnsi="Arial"/>
           <w:b w:val="1"/>
           <w:bCs w:val="1"/>
+          <w:sz w:val="24"/>
           <w:rtl w:val="0"/>
         </w:rPr>
         <w:t xml:space="preserve">Convolutional neural networks: an overview and application in radiology</w:t>
       </w:r>
       <w:r>
         <w:rPr>
+          <w:rFonts w:ascii="Arial" w:hAnsi="Arial"/>
+          <w:sz w:val="24"/>
           <w:rtl w:val="0"/>
         </w:rPr>
         <w:t xml:space="preserve">. </w:t>
       </w:r>
       <w:r>
         <w:rPr>
+          <w:rFonts w:ascii="Arial" w:hAnsi="Arial"/>
           <w:i w:val="1"/>
           <w:iCs w:val="1"/>
+          <w:sz w:val="24"/>
           <w:rtl w:val="0"/>
         </w:rPr>
         <w:t xml:space="preserve">Insights into Imaging</w:t>
       </w:r>
       <w:r>
         <w:rPr>
+          <w:rFonts w:ascii="Arial" w:hAnsi="Arial"/>
+          <w:sz w:val="24"/>
           <w:rtl w:val="0"/>
         </w:rPr>
         <w:t xml:space="preserve">, v. 9, n. 4, p. 611-629, 2018. Disponível em:</w:t>
@@ -19111,6 +19493,8 @@
       </w:hyperlink>
       <w:r>
         <w:rPr>
+          <w:rFonts w:ascii="Arial" w:hAnsi="Arial"/>
+          <w:sz w:val="24"/>
           <w:rtl w:val="0"/>
         </w:rPr>
         <w:t xml:space="preserve">. Acesso em: 16 nov. 2025.</w:t>

</xml_diff>